<commit_message>
SPK Week 5 - Electre IV
</commit_message>
<xml_diff>
--- a/bind/week-5/Week5-TeksDeskripsi.docx
+++ b/bind/week-5/Week5-TeksDeskripsi.docx
@@ -1,6 +1,6 @@
 
 <file path=word/document.xml><?xml version="1.0" encoding="utf-8"?>
-<w:document xmlns:wpc="http://schemas.microsoft.com/office/word/2010/wordprocessingCanvas" xmlns:cx="http://schemas.microsoft.com/office/drawing/2014/chartex" xmlns:cx1="http://schemas.microsoft.com/office/drawing/2015/9/8/chartex" xmlns:cx2="http://schemas.microsoft.com/office/drawing/2015/10/21/chartex" xmlns:cx3="http://schemas.microsoft.com/office/drawing/2016/5/9/chartex" xmlns:cx4="http://schemas.microsoft.com/office/drawing/2016/5/10/chartex" xmlns:cx5="http://schemas.microsoft.com/office/drawing/2016/5/11/chartex" xmlns:cx6="http://schemas.microsoft.com/office/drawing/2016/5/12/chartex" xmlns:cx7="http://schemas.microsoft.com/office/drawing/2016/5/13/chartex" xmlns:cx8="http://schemas.microsoft.com/office/drawing/2016/5/14/chartex" xmlns:mc="http://schemas.openxmlformats.org/markup-compatibility/2006" xmlns:aink="http://schemas.microsoft.com/office/drawing/2016/ink" xmlns:am3d="http://schemas.microsoft.com/office/drawing/2017/model3d" xmlns:o="urn:schemas-microsoft-com:office:office" xmlns:oel="http://schemas.microsoft.com/office/2019/extlst" xmlns:r="http://schemas.openxmlformats.org/officeDocument/2006/relationships" xmlns:m="http://schemas.openxmlformats.org/officeDocument/2006/math" xmlns:v="urn:schemas-microsoft-com:vml" xmlns:wp14="http://schemas.microsoft.com/office/word/2010/wordprocessingDrawing" xmlns:wp="http://schemas.openxmlformats.org/drawingml/2006/wordprocessingDrawing" xmlns:w10="urn:schemas-microsoft-com:office:word" xmlns:w="http://schemas.openxmlformats.org/wordprocessingml/2006/main" xmlns:w14="http://schemas.microsoft.com/office/word/2010/wordml" xmlns:w15="http://schemas.microsoft.com/office/word/2012/wordml" xmlns:w16cex="http://schemas.microsoft.com/office/word/2018/wordml/cex" xmlns:w16cid="http://schemas.microsoft.com/office/word/2016/wordml/cid" xmlns:w16="http://schemas.microsoft.com/office/word/2018/wordml" xmlns:w16du="http://schemas.microsoft.com/office/word/2023/wordml/word16du" xmlns:w16sdtdh="http://schemas.microsoft.com/office/word/2020/wordml/sdtdatahash" xmlns:w16sdtfl="http://schemas.microsoft.com/office/word/2024/wordml/sdtformatlock" xmlns:w16se="http://schemas.microsoft.com/office/word/2015/wordml/symex" xmlns:wpg="http://schemas.microsoft.com/office/word/2010/wordprocessingGroup" xmlns:wpi="http://schemas.microsoft.com/office/word/2010/wordprocessingInk" xmlns:wne="http://schemas.microsoft.com/office/word/2006/wordml" xmlns:wps="http://schemas.microsoft.com/office/word/2010/wordprocessingShape" mc:Ignorable="w14 w15 w16se w16cid w16 w16cex w16sdtdh w16sdtfl w16du wp14">
+<w:document xmlns:wpc="http://schemas.microsoft.com/office/word/2010/wordprocessingCanvas" xmlns:cx="http://schemas.microsoft.com/office/drawing/2014/chartex" xmlns:cx1="http://schemas.microsoft.com/office/drawing/2015/9/8/chartex" xmlns:cx2="http://schemas.microsoft.com/office/drawing/2015/10/21/chartex" xmlns:cx3="http://schemas.microsoft.com/office/drawing/2016/5/9/chartex" xmlns:cx4="http://schemas.microsoft.com/office/drawing/2016/5/10/chartex" xmlns:cx5="http://schemas.microsoft.com/office/drawing/2016/5/11/chartex" xmlns:cx6="http://schemas.microsoft.com/office/drawing/2016/5/12/chartex" xmlns:cx7="http://schemas.microsoft.com/office/drawing/2016/5/13/chartex" xmlns:cx8="http://schemas.microsoft.com/office/drawing/2016/5/14/chartex" xmlns:mc="http://schemas.openxmlformats.org/markup-compatibility/2006" xmlns:aink="http://schemas.microsoft.com/office/drawing/2016/ink" xmlns:am3d="http://schemas.microsoft.com/office/drawing/2017/model3d" xmlns:o="urn:schemas-microsoft-com:office:office" xmlns:oel="http://schemas.microsoft.com/office/2019/extlst" xmlns:r="http://schemas.openxmlformats.org/officeDocument/2006/relationships" xmlns:m="http://schemas.openxmlformats.org/officeDocument/2006/math" xmlns:v="urn:schemas-microsoft-com:vml" xmlns:wp14="http://schemas.microsoft.com/office/word/2010/wordprocessingDrawing" xmlns:wp="http://schemas.openxmlformats.org/drawingml/2006/wordprocessingDrawing" xmlns:w10="urn:schemas-microsoft-com:office:word" xmlns:w="http://schemas.openxmlformats.org/wordprocessingml/2006/main" xmlns:w14="http://schemas.microsoft.com/office/word/2010/wordml" xmlns:w15="http://schemas.microsoft.com/office/word/2012/wordml" xmlns:w16cex="http://schemas.microsoft.com/office/word/2018/wordml/cex" xmlns:w16cid="http://schemas.microsoft.com/office/word/2016/wordml/cid" xmlns:w16="http://schemas.microsoft.com/office/word/2018/wordml" xmlns:w16du="http://schemas.microsoft.com/office/word/2023/wordml/word16du" xmlns:w16sdtdh="http://schemas.microsoft.com/office/word/2020/wordml/sdtdatahash" xmlns:w16se="http://schemas.microsoft.com/office/word/2015/wordml/symex" xmlns:wpg="http://schemas.microsoft.com/office/word/2010/wordprocessingGroup" xmlns:wpi="http://schemas.microsoft.com/office/word/2010/wordprocessingInk" xmlns:wne="http://schemas.microsoft.com/office/word/2006/wordml" xmlns:wps="http://schemas.microsoft.com/office/word/2010/wordprocessingShape" mc:Ignorable="w14 w15 w16se w16cid w16 w16cex w16sdtdh w16du wp14">
   <w:body>
     <w:p>
       <w:pPr>
@@ -302,7 +302,7 @@
         </w:rPr>
         <w:lastRenderedPageBreak/>
         <w:drawing>
-          <wp:inline distT="0" distB="0" distL="0" distR="0" wp14:anchorId="0F5B8442" wp14:editId="5C177F6D">
+          <wp:inline distT="0" distB="0" distL="0" distR="0" wp14:anchorId="0F5B8442" wp14:editId="163D0A4A">
             <wp:extent cx="4069492" cy="5086865"/>
             <wp:effectExtent l="0" t="0" r="0" b="6350"/>
             <wp:docPr id="1822745269" name="Picture 1" descr="A person standing in front of a graph&#10;&#10;AI-generated content may be incorrect."/>
@@ -362,401 +362,45 @@
           <w14:ligatures w14:val="none"/>
         </w:rPr>
       </w:pPr>
-      <w:proofErr w:type="spellStart"/>
-      <w:r>
-        <w:rPr>
-          <w:rFonts w:ascii="Times New Roman" w:eastAsia="Times New Roman" w:hAnsi="Times New Roman" w:cs="Times New Roman"/>
-          <w:kern w:val="0"/>
-          <w14:ligatures w14:val="none"/>
-        </w:rPr>
-        <w:t>Jumlah</w:t>
-      </w:r>
-      <w:proofErr w:type="spellEnd"/>
-      <w:r>
-        <w:rPr>
-          <w:rFonts w:ascii="Times New Roman" w:eastAsia="Times New Roman" w:hAnsi="Times New Roman" w:cs="Times New Roman"/>
-          <w:kern w:val="0"/>
-          <w14:ligatures w14:val="none"/>
-        </w:rPr>
-        <w:t xml:space="preserve"> </w:t>
-      </w:r>
-      <w:proofErr w:type="spellStart"/>
-      <w:r>
-        <w:rPr>
-          <w:rFonts w:ascii="Times New Roman" w:eastAsia="Times New Roman" w:hAnsi="Times New Roman" w:cs="Times New Roman"/>
-          <w:kern w:val="0"/>
-          <w14:ligatures w14:val="none"/>
-        </w:rPr>
-        <w:t>pengguna</w:t>
-      </w:r>
-      <w:proofErr w:type="spellEnd"/>
-      <w:r>
-        <w:rPr>
-          <w:rFonts w:ascii="Times New Roman" w:eastAsia="Times New Roman" w:hAnsi="Times New Roman" w:cs="Times New Roman"/>
-          <w:kern w:val="0"/>
-          <w14:ligatures w14:val="none"/>
-        </w:rPr>
-        <w:t xml:space="preserve"> internet di Indonesia </w:t>
-      </w:r>
-      <w:proofErr w:type="spellStart"/>
-      <w:r>
-        <w:rPr>
-          <w:rFonts w:ascii="Times New Roman" w:eastAsia="Times New Roman" w:hAnsi="Times New Roman" w:cs="Times New Roman"/>
-          <w:kern w:val="0"/>
-          <w14:ligatures w14:val="none"/>
-        </w:rPr>
-        <w:t>terus</w:t>
-      </w:r>
-      <w:proofErr w:type="spellEnd"/>
-      <w:r>
-        <w:rPr>
-          <w:rFonts w:ascii="Times New Roman" w:eastAsia="Times New Roman" w:hAnsi="Times New Roman" w:cs="Times New Roman"/>
-          <w:kern w:val="0"/>
-          <w14:ligatures w14:val="none"/>
-        </w:rPr>
-        <w:t xml:space="preserve"> </w:t>
-      </w:r>
-      <w:proofErr w:type="spellStart"/>
-      <w:r>
-        <w:rPr>
-          <w:rFonts w:ascii="Times New Roman" w:eastAsia="Times New Roman" w:hAnsi="Times New Roman" w:cs="Times New Roman"/>
-          <w:kern w:val="0"/>
-          <w14:ligatures w14:val="none"/>
-        </w:rPr>
-        <w:t>mengalami</w:t>
-      </w:r>
-      <w:proofErr w:type="spellEnd"/>
-      <w:r>
-        <w:rPr>
-          <w:rFonts w:ascii="Times New Roman" w:eastAsia="Times New Roman" w:hAnsi="Times New Roman" w:cs="Times New Roman"/>
-          <w:kern w:val="0"/>
-          <w14:ligatures w14:val="none"/>
-        </w:rPr>
-        <w:t xml:space="preserve"> </w:t>
-      </w:r>
-      <w:proofErr w:type="spellStart"/>
-      <w:r>
-        <w:rPr>
-          <w:rFonts w:ascii="Times New Roman" w:eastAsia="Times New Roman" w:hAnsi="Times New Roman" w:cs="Times New Roman"/>
-          <w:kern w:val="0"/>
-          <w14:ligatures w14:val="none"/>
-        </w:rPr>
-        <w:t>peningkatan</w:t>
-      </w:r>
-      <w:proofErr w:type="spellEnd"/>
-      <w:r>
-        <w:rPr>
-          <w:rFonts w:ascii="Times New Roman" w:eastAsia="Times New Roman" w:hAnsi="Times New Roman" w:cs="Times New Roman"/>
-          <w:kern w:val="0"/>
-          <w14:ligatures w14:val="none"/>
-        </w:rPr>
-        <w:t xml:space="preserve"> </w:t>
-      </w:r>
-      <w:proofErr w:type="spellStart"/>
-      <w:r>
-        <w:rPr>
-          <w:rFonts w:ascii="Times New Roman" w:eastAsia="Times New Roman" w:hAnsi="Times New Roman" w:cs="Times New Roman"/>
-          <w:kern w:val="0"/>
-          <w14:ligatures w14:val="none"/>
-        </w:rPr>
-        <w:t>dari</w:t>
-      </w:r>
-      <w:proofErr w:type="spellEnd"/>
-      <w:r>
-        <w:rPr>
-          <w:rFonts w:ascii="Times New Roman" w:eastAsia="Times New Roman" w:hAnsi="Times New Roman" w:cs="Times New Roman"/>
-          <w:kern w:val="0"/>
-          <w14:ligatures w14:val="none"/>
-        </w:rPr>
-        <w:t xml:space="preserve"> </w:t>
-      </w:r>
-      <w:proofErr w:type="spellStart"/>
-      <w:r>
-        <w:rPr>
-          <w:rFonts w:ascii="Times New Roman" w:eastAsia="Times New Roman" w:hAnsi="Times New Roman" w:cs="Times New Roman"/>
-          <w:kern w:val="0"/>
-          <w14:ligatures w14:val="none"/>
-        </w:rPr>
-        <w:t>tahun</w:t>
-      </w:r>
-      <w:proofErr w:type="spellEnd"/>
-      <w:r>
-        <w:rPr>
-          <w:rFonts w:ascii="Times New Roman" w:eastAsia="Times New Roman" w:hAnsi="Times New Roman" w:cs="Times New Roman"/>
-          <w:kern w:val="0"/>
-          <w14:ligatures w14:val="none"/>
-        </w:rPr>
-        <w:t xml:space="preserve"> </w:t>
-      </w:r>
-      <w:proofErr w:type="spellStart"/>
-      <w:r>
-        <w:rPr>
-          <w:rFonts w:ascii="Times New Roman" w:eastAsia="Times New Roman" w:hAnsi="Times New Roman" w:cs="Times New Roman"/>
-          <w:kern w:val="0"/>
-          <w14:ligatures w14:val="none"/>
-        </w:rPr>
-        <w:t>ke</w:t>
-      </w:r>
-      <w:proofErr w:type="spellEnd"/>
-      <w:r>
-        <w:rPr>
-          <w:rFonts w:ascii="Times New Roman" w:eastAsia="Times New Roman" w:hAnsi="Times New Roman" w:cs="Times New Roman"/>
-          <w:kern w:val="0"/>
-          <w14:ligatures w14:val="none"/>
-        </w:rPr>
-        <w:t xml:space="preserve"> </w:t>
-      </w:r>
-      <w:proofErr w:type="spellStart"/>
-      <w:r>
-        <w:rPr>
-          <w:rFonts w:ascii="Times New Roman" w:eastAsia="Times New Roman" w:hAnsi="Times New Roman" w:cs="Times New Roman"/>
-          <w:kern w:val="0"/>
-          <w14:ligatures w14:val="none"/>
-        </w:rPr>
-        <w:t>tahun</w:t>
-      </w:r>
-      <w:proofErr w:type="spellEnd"/>
-      <w:r>
-        <w:rPr>
-          <w:rFonts w:ascii="Times New Roman" w:eastAsia="Times New Roman" w:hAnsi="Times New Roman" w:cs="Times New Roman"/>
-          <w:kern w:val="0"/>
-          <w14:ligatures w14:val="none"/>
-        </w:rPr>
-        <w:t xml:space="preserve">. </w:t>
-      </w:r>
-      <w:proofErr w:type="spellStart"/>
-      <w:r>
-        <w:rPr>
-          <w:rFonts w:ascii="Times New Roman" w:eastAsia="Times New Roman" w:hAnsi="Times New Roman" w:cs="Times New Roman"/>
-          <w:kern w:val="0"/>
-          <w14:ligatures w14:val="none"/>
-        </w:rPr>
-        <w:t>Berdasarkan</w:t>
-      </w:r>
-      <w:proofErr w:type="spellEnd"/>
-      <w:r>
-        <w:rPr>
-          <w:rFonts w:ascii="Times New Roman" w:eastAsia="Times New Roman" w:hAnsi="Times New Roman" w:cs="Times New Roman"/>
-          <w:kern w:val="0"/>
-          <w14:ligatures w14:val="none"/>
-        </w:rPr>
-        <w:t xml:space="preserve"> data </w:t>
-      </w:r>
-      <w:proofErr w:type="spellStart"/>
-      <w:r>
-        <w:rPr>
-          <w:rFonts w:ascii="Times New Roman" w:eastAsia="Times New Roman" w:hAnsi="Times New Roman" w:cs="Times New Roman"/>
-          <w:kern w:val="0"/>
-          <w14:ligatures w14:val="none"/>
-        </w:rPr>
-        <w:t>dari</w:t>
-      </w:r>
-      <w:proofErr w:type="spellEnd"/>
-      <w:r>
-        <w:rPr>
-          <w:rFonts w:ascii="Times New Roman" w:eastAsia="Times New Roman" w:hAnsi="Times New Roman" w:cs="Times New Roman"/>
-          <w:kern w:val="0"/>
-          <w14:ligatures w14:val="none"/>
-        </w:rPr>
-        <w:t xml:space="preserve"> </w:t>
-      </w:r>
-      <w:proofErr w:type="spellStart"/>
-      <w:r>
-        <w:rPr>
-          <w:rFonts w:ascii="Times New Roman" w:eastAsia="Times New Roman" w:hAnsi="Times New Roman" w:cs="Times New Roman"/>
-          <w:kern w:val="0"/>
-          <w14:ligatures w14:val="none"/>
-        </w:rPr>
-        <w:t>Asosiasi</w:t>
-      </w:r>
-      <w:proofErr w:type="spellEnd"/>
-      <w:r>
-        <w:rPr>
-          <w:rFonts w:ascii="Times New Roman" w:eastAsia="Times New Roman" w:hAnsi="Times New Roman" w:cs="Times New Roman"/>
-          <w:kern w:val="0"/>
-          <w14:ligatures w14:val="none"/>
-        </w:rPr>
-        <w:t xml:space="preserve"> </w:t>
-      </w:r>
-      <w:proofErr w:type="spellStart"/>
-      <w:r>
-        <w:rPr>
-          <w:rFonts w:ascii="Times New Roman" w:eastAsia="Times New Roman" w:hAnsi="Times New Roman" w:cs="Times New Roman"/>
-          <w:kern w:val="0"/>
-          <w14:ligatures w14:val="none"/>
-        </w:rPr>
-        <w:t>Penyelenggara</w:t>
-      </w:r>
-      <w:proofErr w:type="spellEnd"/>
-      <w:r>
-        <w:rPr>
-          <w:rFonts w:ascii="Times New Roman" w:eastAsia="Times New Roman" w:hAnsi="Times New Roman" w:cs="Times New Roman"/>
-          <w:kern w:val="0"/>
-          <w14:ligatures w14:val="none"/>
-        </w:rPr>
-        <w:t xml:space="preserve"> Jasa Internet Indonesia (APJII) </w:t>
-      </w:r>
-      <w:proofErr w:type="spellStart"/>
-      <w:r>
-        <w:rPr>
-          <w:rFonts w:ascii="Times New Roman" w:eastAsia="Times New Roman" w:hAnsi="Times New Roman" w:cs="Times New Roman"/>
-          <w:kern w:val="0"/>
-          <w14:ligatures w14:val="none"/>
-        </w:rPr>
-        <w:t>dalam</w:t>
-      </w:r>
-      <w:proofErr w:type="spellEnd"/>
-      <w:r>
-        <w:rPr>
-          <w:rFonts w:ascii="Times New Roman" w:eastAsia="Times New Roman" w:hAnsi="Times New Roman" w:cs="Times New Roman"/>
-          <w:kern w:val="0"/>
-          <w14:ligatures w14:val="none"/>
-        </w:rPr>
-        <w:t xml:space="preserve"> </w:t>
-      </w:r>
-      <w:proofErr w:type="spellStart"/>
-      <w:r>
-        <w:rPr>
-          <w:rFonts w:ascii="Times New Roman" w:eastAsia="Times New Roman" w:hAnsi="Times New Roman" w:cs="Times New Roman"/>
-          <w:kern w:val="0"/>
-          <w14:ligatures w14:val="none"/>
-        </w:rPr>
-        <w:t>Survei</w:t>
-      </w:r>
-      <w:proofErr w:type="spellEnd"/>
-      <w:r>
-        <w:rPr>
-          <w:rFonts w:ascii="Times New Roman" w:eastAsia="Times New Roman" w:hAnsi="Times New Roman" w:cs="Times New Roman"/>
-          <w:kern w:val="0"/>
-          <w14:ligatures w14:val="none"/>
-        </w:rPr>
-        <w:t xml:space="preserve"> </w:t>
-      </w:r>
-      <w:proofErr w:type="spellStart"/>
-      <w:r>
-        <w:rPr>
-          <w:rFonts w:ascii="Times New Roman" w:eastAsia="Times New Roman" w:hAnsi="Times New Roman" w:cs="Times New Roman"/>
-          <w:kern w:val="0"/>
-          <w14:ligatures w14:val="none"/>
-        </w:rPr>
-        <w:t>Penetrasi</w:t>
-      </w:r>
-      <w:proofErr w:type="spellEnd"/>
-      <w:r>
-        <w:rPr>
-          <w:rFonts w:ascii="Times New Roman" w:eastAsia="Times New Roman" w:hAnsi="Times New Roman" w:cs="Times New Roman"/>
-          <w:kern w:val="0"/>
-          <w14:ligatures w14:val="none"/>
-        </w:rPr>
-        <w:t xml:space="preserve"> Internet Indonesia 2023, </w:t>
-      </w:r>
-      <w:proofErr w:type="spellStart"/>
-      <w:r>
-        <w:rPr>
-          <w:rFonts w:ascii="Times New Roman" w:eastAsia="Times New Roman" w:hAnsi="Times New Roman" w:cs="Times New Roman"/>
-          <w:kern w:val="0"/>
-          <w14:ligatures w14:val="none"/>
-        </w:rPr>
-        <w:t>tercatat</w:t>
-      </w:r>
-      <w:proofErr w:type="spellEnd"/>
-      <w:r>
-        <w:rPr>
-          <w:rFonts w:ascii="Times New Roman" w:eastAsia="Times New Roman" w:hAnsi="Times New Roman" w:cs="Times New Roman"/>
-          <w:kern w:val="0"/>
-          <w14:ligatures w14:val="none"/>
-        </w:rPr>
-        <w:t xml:space="preserve"> </w:t>
-      </w:r>
-      <w:proofErr w:type="spellStart"/>
-      <w:r>
-        <w:rPr>
-          <w:rFonts w:ascii="Times New Roman" w:eastAsia="Times New Roman" w:hAnsi="Times New Roman" w:cs="Times New Roman"/>
-          <w:kern w:val="0"/>
-          <w14:ligatures w14:val="none"/>
-        </w:rPr>
-        <w:t>bahwa</w:t>
-      </w:r>
-      <w:proofErr w:type="spellEnd"/>
-      <w:r>
-        <w:rPr>
-          <w:rFonts w:ascii="Times New Roman" w:eastAsia="Times New Roman" w:hAnsi="Times New Roman" w:cs="Times New Roman"/>
-          <w:kern w:val="0"/>
-          <w14:ligatures w14:val="none"/>
-        </w:rPr>
-        <w:t xml:space="preserve"> pada </w:t>
-      </w:r>
-      <w:proofErr w:type="spellStart"/>
-      <w:r>
-        <w:rPr>
-          <w:rFonts w:ascii="Times New Roman" w:eastAsia="Times New Roman" w:hAnsi="Times New Roman" w:cs="Times New Roman"/>
-          <w:kern w:val="0"/>
-          <w14:ligatures w14:val="none"/>
-        </w:rPr>
-        <w:t>tahun</w:t>
-      </w:r>
-      <w:proofErr w:type="spellEnd"/>
-      <w:r>
-        <w:rPr>
-          <w:rFonts w:ascii="Times New Roman" w:eastAsia="Times New Roman" w:hAnsi="Times New Roman" w:cs="Times New Roman"/>
-          <w:kern w:val="0"/>
-          <w14:ligatures w14:val="none"/>
-        </w:rPr>
-        <w:t xml:space="preserve"> 2022-2023 </w:t>
-      </w:r>
-      <w:proofErr w:type="spellStart"/>
-      <w:r>
-        <w:rPr>
-          <w:rFonts w:ascii="Times New Roman" w:eastAsia="Times New Roman" w:hAnsi="Times New Roman" w:cs="Times New Roman"/>
-          <w:kern w:val="0"/>
-          <w14:ligatures w14:val="none"/>
-        </w:rPr>
-        <w:t>jumlah</w:t>
-      </w:r>
-      <w:proofErr w:type="spellEnd"/>
-      <w:r>
-        <w:rPr>
-          <w:rFonts w:ascii="Times New Roman" w:eastAsia="Times New Roman" w:hAnsi="Times New Roman" w:cs="Times New Roman"/>
-          <w:kern w:val="0"/>
-          <w14:ligatures w14:val="none"/>
-        </w:rPr>
-        <w:t xml:space="preserve"> </w:t>
-      </w:r>
-      <w:proofErr w:type="spellStart"/>
-      <w:r>
-        <w:rPr>
-          <w:rFonts w:ascii="Times New Roman" w:eastAsia="Times New Roman" w:hAnsi="Times New Roman" w:cs="Times New Roman"/>
-          <w:kern w:val="0"/>
-          <w14:ligatures w14:val="none"/>
-        </w:rPr>
-        <w:t>pengguna</w:t>
-      </w:r>
-      <w:proofErr w:type="spellEnd"/>
-      <w:r>
-        <w:rPr>
-          <w:rFonts w:ascii="Times New Roman" w:eastAsia="Times New Roman" w:hAnsi="Times New Roman" w:cs="Times New Roman"/>
-          <w:kern w:val="0"/>
-          <w14:ligatures w14:val="none"/>
-        </w:rPr>
-        <w:t xml:space="preserve"> internet </w:t>
-      </w:r>
-      <w:proofErr w:type="spellStart"/>
-      <w:r>
-        <w:rPr>
-          <w:rFonts w:ascii="Times New Roman" w:eastAsia="Times New Roman" w:hAnsi="Times New Roman" w:cs="Times New Roman"/>
-          <w:kern w:val="0"/>
-          <w14:ligatures w14:val="none"/>
-        </w:rPr>
-        <w:t>mencapai</w:t>
-      </w:r>
-      <w:proofErr w:type="spellEnd"/>
-      <w:r>
-        <w:rPr>
-          <w:rFonts w:ascii="Times New Roman" w:eastAsia="Times New Roman" w:hAnsi="Times New Roman" w:cs="Times New Roman"/>
-          <w:kern w:val="0"/>
-          <w14:ligatures w14:val="none"/>
-        </w:rPr>
-        <w:t xml:space="preserve"> </w:t>
+      <w:r>
+        <w:rPr>
+          <w:rFonts w:ascii="Times New Roman" w:eastAsia="Times New Roman" w:hAnsi="Times New Roman" w:cs="Times New Roman"/>
+          <w:kern w:val="0"/>
+          <w14:ligatures w14:val="none"/>
+        </w:rPr>
+        <w:t xml:space="preserve">Jumlah pengguna internet di Indonesia terus mengalami peningkatan dari tahun </w:t>
+      </w:r>
+      <w:r>
+        <w:rPr>
+          <w:rFonts w:ascii="Times New Roman" w:eastAsia="Times New Roman" w:hAnsi="Times New Roman" w:cs="Times New Roman"/>
+          <w:kern w:val="0"/>
+          <w14:ligatures w14:val="none"/>
+        </w:rPr>
+        <w:t xml:space="preserve">2015 </w:t>
+      </w:r>
+      <w:r>
+        <w:rPr>
+          <w:rFonts w:ascii="Times New Roman" w:eastAsia="Times New Roman" w:hAnsi="Times New Roman" w:cs="Times New Roman"/>
+          <w:kern w:val="0"/>
+          <w14:ligatures w14:val="none"/>
+        </w:rPr>
+        <w:t>hingga tahun</w:t>
+      </w:r>
+      <w:r>
+        <w:rPr>
+          <w:rFonts w:ascii="Times New Roman" w:eastAsia="Times New Roman" w:hAnsi="Times New Roman" w:cs="Times New Roman"/>
+          <w:kern w:val="0"/>
+          <w14:ligatures w14:val="none"/>
+        </w:rPr>
+        <w:t xml:space="preserve"> 2023</w:t>
+      </w:r>
+      <w:r>
+        <w:rPr>
+          <w:rFonts w:ascii="Times New Roman" w:eastAsia="Times New Roman" w:hAnsi="Times New Roman" w:cs="Times New Roman"/>
+          <w:kern w:val="0"/>
+          <w14:ligatures w14:val="none"/>
+        </w:rPr>
+        <w:t xml:space="preserve">. Berdasarkan data dari Asosiasi Penyelenggara Jasa Internet Indonesia (APJII) dalam Survei Penetrasi Internet Indonesia 2023, tercatat bahwa pada tahun 2022-2023 jumlah pengguna internet mencapai </w:t>
       </w:r>
       <w:r>
         <w:rPr>
@@ -766,9 +410,34 @@
           <w:kern w:val="0"/>
           <w14:ligatures w14:val="none"/>
         </w:rPr>
-        <w:t xml:space="preserve">215,63 </w:t>
-      </w:r>
-      <w:proofErr w:type="spellStart"/>
+        <w:t>215,63 juta</w:t>
+      </w:r>
+      <w:r>
+        <w:rPr>
+          <w:rFonts w:ascii="Times New Roman" w:eastAsia="Times New Roman" w:hAnsi="Times New Roman" w:cs="Times New Roman"/>
+          <w:kern w:val="0"/>
+          <w14:ligatures w14:val="none"/>
+        </w:rPr>
+        <w:t>.</w:t>
+      </w:r>
+    </w:p>
+    <w:p>
+      <w:pPr>
+        <w:spacing w:before="100" w:beforeAutospacing="1" w:after="100" w:afterAutospacing="1" w:line="360" w:lineRule="auto"/>
+        <w:rPr>
+          <w:rFonts w:ascii="Times New Roman" w:eastAsia="Times New Roman" w:hAnsi="Times New Roman" w:cs="Times New Roman"/>
+          <w:kern w:val="0"/>
+          <w14:ligatures w14:val="none"/>
+        </w:rPr>
+      </w:pPr>
+      <w:r>
+        <w:rPr>
+          <w:rFonts w:ascii="Times New Roman" w:eastAsia="Times New Roman" w:hAnsi="Times New Roman" w:cs="Times New Roman"/>
+          <w:kern w:val="0"/>
+          <w14:ligatures w14:val="none"/>
+        </w:rPr>
+        <w:t xml:space="preserve">Tren kenaikan ini terlihat jelas sejak tahun 2015, di mana pengguna internet hanya sebanyak </w:t>
+      </w:r>
       <w:r>
         <w:rPr>
           <w:rFonts w:ascii="Times New Roman" w:eastAsia="Times New Roman" w:hAnsi="Times New Roman" w:cs="Times New Roman"/>
@@ -777,316 +446,15 @@
           <w:kern w:val="0"/>
           <w14:ligatures w14:val="none"/>
         </w:rPr>
-        <w:t>juta</w:t>
-      </w:r>
-      <w:proofErr w:type="spellEnd"/>
-      <w:r>
-        <w:rPr>
-          <w:rFonts w:ascii="Times New Roman" w:eastAsia="Times New Roman" w:hAnsi="Times New Roman" w:cs="Times New Roman"/>
-          <w:kern w:val="0"/>
-          <w14:ligatures w14:val="none"/>
-        </w:rPr>
-        <w:t>.</w:t>
-      </w:r>
-    </w:p>
-    <w:p>
-      <w:pPr>
-        <w:spacing w:before="100" w:beforeAutospacing="1" w:after="100" w:afterAutospacing="1" w:line="360" w:lineRule="auto"/>
-        <w:rPr>
-          <w:rFonts w:ascii="Times New Roman" w:eastAsia="Times New Roman" w:hAnsi="Times New Roman" w:cs="Times New Roman"/>
-          <w:kern w:val="0"/>
-          <w14:ligatures w14:val="none"/>
-        </w:rPr>
-      </w:pPr>
-      <w:r>
-        <w:rPr>
-          <w:rFonts w:ascii="Times New Roman" w:eastAsia="Times New Roman" w:hAnsi="Times New Roman" w:cs="Times New Roman"/>
-          <w:kern w:val="0"/>
-          <w14:ligatures w14:val="none"/>
-        </w:rPr>
-        <w:t xml:space="preserve">Tren </w:t>
-      </w:r>
-      <w:proofErr w:type="spellStart"/>
-      <w:r>
-        <w:rPr>
-          <w:rFonts w:ascii="Times New Roman" w:eastAsia="Times New Roman" w:hAnsi="Times New Roman" w:cs="Times New Roman"/>
-          <w:kern w:val="0"/>
-          <w14:ligatures w14:val="none"/>
-        </w:rPr>
-        <w:t>kenaikan</w:t>
-      </w:r>
-      <w:proofErr w:type="spellEnd"/>
-      <w:r>
-        <w:rPr>
-          <w:rFonts w:ascii="Times New Roman" w:eastAsia="Times New Roman" w:hAnsi="Times New Roman" w:cs="Times New Roman"/>
-          <w:kern w:val="0"/>
-          <w14:ligatures w14:val="none"/>
-        </w:rPr>
-        <w:t xml:space="preserve"> </w:t>
-      </w:r>
-      <w:proofErr w:type="spellStart"/>
-      <w:r>
-        <w:rPr>
-          <w:rFonts w:ascii="Times New Roman" w:eastAsia="Times New Roman" w:hAnsi="Times New Roman" w:cs="Times New Roman"/>
-          <w:kern w:val="0"/>
-          <w14:ligatures w14:val="none"/>
-        </w:rPr>
-        <w:t>ini</w:t>
-      </w:r>
-      <w:proofErr w:type="spellEnd"/>
-      <w:r>
-        <w:rPr>
-          <w:rFonts w:ascii="Times New Roman" w:eastAsia="Times New Roman" w:hAnsi="Times New Roman" w:cs="Times New Roman"/>
-          <w:kern w:val="0"/>
-          <w14:ligatures w14:val="none"/>
-        </w:rPr>
-        <w:t xml:space="preserve"> </w:t>
-      </w:r>
-      <w:proofErr w:type="spellStart"/>
-      <w:r>
-        <w:rPr>
-          <w:rFonts w:ascii="Times New Roman" w:eastAsia="Times New Roman" w:hAnsi="Times New Roman" w:cs="Times New Roman"/>
-          <w:kern w:val="0"/>
-          <w14:ligatures w14:val="none"/>
-        </w:rPr>
-        <w:t>terlihat</w:t>
-      </w:r>
-      <w:proofErr w:type="spellEnd"/>
-      <w:r>
-        <w:rPr>
-          <w:rFonts w:ascii="Times New Roman" w:eastAsia="Times New Roman" w:hAnsi="Times New Roman" w:cs="Times New Roman"/>
-          <w:kern w:val="0"/>
-          <w14:ligatures w14:val="none"/>
-        </w:rPr>
-        <w:t xml:space="preserve"> </w:t>
-      </w:r>
-      <w:proofErr w:type="spellStart"/>
-      <w:r>
-        <w:rPr>
-          <w:rFonts w:ascii="Times New Roman" w:eastAsia="Times New Roman" w:hAnsi="Times New Roman" w:cs="Times New Roman"/>
-          <w:kern w:val="0"/>
-          <w14:ligatures w14:val="none"/>
-        </w:rPr>
-        <w:t>jelas</w:t>
-      </w:r>
-      <w:proofErr w:type="spellEnd"/>
-      <w:r>
-        <w:rPr>
-          <w:rFonts w:ascii="Times New Roman" w:eastAsia="Times New Roman" w:hAnsi="Times New Roman" w:cs="Times New Roman"/>
-          <w:kern w:val="0"/>
-          <w14:ligatures w14:val="none"/>
-        </w:rPr>
-        <w:t xml:space="preserve"> </w:t>
-      </w:r>
-      <w:proofErr w:type="spellStart"/>
-      <w:r>
-        <w:rPr>
-          <w:rFonts w:ascii="Times New Roman" w:eastAsia="Times New Roman" w:hAnsi="Times New Roman" w:cs="Times New Roman"/>
-          <w:kern w:val="0"/>
-          <w14:ligatures w14:val="none"/>
-        </w:rPr>
-        <w:t>sejak</w:t>
-      </w:r>
-      <w:proofErr w:type="spellEnd"/>
-      <w:r>
-        <w:rPr>
-          <w:rFonts w:ascii="Times New Roman" w:eastAsia="Times New Roman" w:hAnsi="Times New Roman" w:cs="Times New Roman"/>
-          <w:kern w:val="0"/>
-          <w14:ligatures w14:val="none"/>
-        </w:rPr>
-        <w:t xml:space="preserve"> </w:t>
-      </w:r>
-      <w:proofErr w:type="spellStart"/>
-      <w:r>
-        <w:rPr>
-          <w:rFonts w:ascii="Times New Roman" w:eastAsia="Times New Roman" w:hAnsi="Times New Roman" w:cs="Times New Roman"/>
-          <w:kern w:val="0"/>
-          <w14:ligatures w14:val="none"/>
-        </w:rPr>
-        <w:t>tahun</w:t>
-      </w:r>
-      <w:proofErr w:type="spellEnd"/>
-      <w:r>
-        <w:rPr>
-          <w:rFonts w:ascii="Times New Roman" w:eastAsia="Times New Roman" w:hAnsi="Times New Roman" w:cs="Times New Roman"/>
-          <w:kern w:val="0"/>
-          <w14:ligatures w14:val="none"/>
-        </w:rPr>
-        <w:t xml:space="preserve"> 2015, di mana </w:t>
-      </w:r>
-      <w:proofErr w:type="spellStart"/>
-      <w:r>
-        <w:rPr>
-          <w:rFonts w:ascii="Times New Roman" w:eastAsia="Times New Roman" w:hAnsi="Times New Roman" w:cs="Times New Roman"/>
-          <w:kern w:val="0"/>
-          <w14:ligatures w14:val="none"/>
-        </w:rPr>
-        <w:t>pengguna</w:t>
-      </w:r>
-      <w:proofErr w:type="spellEnd"/>
-      <w:r>
-        <w:rPr>
-          <w:rFonts w:ascii="Times New Roman" w:eastAsia="Times New Roman" w:hAnsi="Times New Roman" w:cs="Times New Roman"/>
-          <w:kern w:val="0"/>
-          <w14:ligatures w14:val="none"/>
-        </w:rPr>
-        <w:t xml:space="preserve"> internet </w:t>
-      </w:r>
-      <w:proofErr w:type="spellStart"/>
-      <w:r>
-        <w:rPr>
-          <w:rFonts w:ascii="Times New Roman" w:eastAsia="Times New Roman" w:hAnsi="Times New Roman" w:cs="Times New Roman"/>
-          <w:kern w:val="0"/>
-          <w14:ligatures w14:val="none"/>
-        </w:rPr>
-        <w:t>hanya</w:t>
-      </w:r>
-      <w:proofErr w:type="spellEnd"/>
-      <w:r>
-        <w:rPr>
-          <w:rFonts w:ascii="Times New Roman" w:eastAsia="Times New Roman" w:hAnsi="Times New Roman" w:cs="Times New Roman"/>
-          <w:kern w:val="0"/>
-          <w14:ligatures w14:val="none"/>
-        </w:rPr>
-        <w:t xml:space="preserve"> </w:t>
-      </w:r>
-      <w:proofErr w:type="spellStart"/>
-      <w:r>
-        <w:rPr>
-          <w:rFonts w:ascii="Times New Roman" w:eastAsia="Times New Roman" w:hAnsi="Times New Roman" w:cs="Times New Roman"/>
-          <w:kern w:val="0"/>
-          <w14:ligatures w14:val="none"/>
-        </w:rPr>
-        <w:t>sebanyak</w:t>
-      </w:r>
-      <w:proofErr w:type="spellEnd"/>
-      <w:r>
-        <w:rPr>
-          <w:rFonts w:ascii="Times New Roman" w:eastAsia="Times New Roman" w:hAnsi="Times New Roman" w:cs="Times New Roman"/>
-          <w:kern w:val="0"/>
-          <w14:ligatures w14:val="none"/>
-        </w:rPr>
-        <w:t xml:space="preserve"> </w:t>
-      </w:r>
-      <w:r>
-        <w:rPr>
-          <w:rFonts w:ascii="Times New Roman" w:eastAsia="Times New Roman" w:hAnsi="Times New Roman" w:cs="Times New Roman"/>
-          <w:b/>
-          <w:bCs/>
-          <w:kern w:val="0"/>
-          <w14:ligatures w14:val="none"/>
-        </w:rPr>
-        <w:t xml:space="preserve">110,2 </w:t>
-      </w:r>
-      <w:proofErr w:type="spellStart"/>
-      <w:r>
-        <w:rPr>
-          <w:rFonts w:ascii="Times New Roman" w:eastAsia="Times New Roman" w:hAnsi="Times New Roman" w:cs="Times New Roman"/>
-          <w:b/>
-          <w:bCs/>
-          <w:kern w:val="0"/>
-          <w14:ligatures w14:val="none"/>
-        </w:rPr>
-        <w:t>juta</w:t>
-      </w:r>
-      <w:proofErr w:type="spellEnd"/>
-      <w:r>
-        <w:rPr>
-          <w:rFonts w:ascii="Times New Roman" w:eastAsia="Times New Roman" w:hAnsi="Times New Roman" w:cs="Times New Roman"/>
-          <w:kern w:val="0"/>
-          <w14:ligatures w14:val="none"/>
-        </w:rPr>
-        <w:t xml:space="preserve">. Angka </w:t>
-      </w:r>
-      <w:proofErr w:type="spellStart"/>
-      <w:r>
-        <w:rPr>
-          <w:rFonts w:ascii="Times New Roman" w:eastAsia="Times New Roman" w:hAnsi="Times New Roman" w:cs="Times New Roman"/>
-          <w:kern w:val="0"/>
-          <w14:ligatures w14:val="none"/>
-        </w:rPr>
-        <w:t>ini</w:t>
-      </w:r>
-      <w:proofErr w:type="spellEnd"/>
-      <w:r>
-        <w:rPr>
-          <w:rFonts w:ascii="Times New Roman" w:eastAsia="Times New Roman" w:hAnsi="Times New Roman" w:cs="Times New Roman"/>
-          <w:kern w:val="0"/>
-          <w14:ligatures w14:val="none"/>
-        </w:rPr>
-        <w:t xml:space="preserve"> </w:t>
-      </w:r>
-      <w:proofErr w:type="spellStart"/>
-      <w:r>
-        <w:rPr>
-          <w:rFonts w:ascii="Times New Roman" w:eastAsia="Times New Roman" w:hAnsi="Times New Roman" w:cs="Times New Roman"/>
-          <w:kern w:val="0"/>
-          <w14:ligatures w14:val="none"/>
-        </w:rPr>
-        <w:t>terus</w:t>
-      </w:r>
-      <w:proofErr w:type="spellEnd"/>
-      <w:r>
-        <w:rPr>
-          <w:rFonts w:ascii="Times New Roman" w:eastAsia="Times New Roman" w:hAnsi="Times New Roman" w:cs="Times New Roman"/>
-          <w:kern w:val="0"/>
-          <w14:ligatures w14:val="none"/>
-        </w:rPr>
-        <w:t xml:space="preserve"> </w:t>
-      </w:r>
-      <w:proofErr w:type="spellStart"/>
-      <w:r>
-        <w:rPr>
-          <w:rFonts w:ascii="Times New Roman" w:eastAsia="Times New Roman" w:hAnsi="Times New Roman" w:cs="Times New Roman"/>
-          <w:kern w:val="0"/>
-          <w14:ligatures w14:val="none"/>
-        </w:rPr>
-        <w:t>bertambah</w:t>
-      </w:r>
-      <w:proofErr w:type="spellEnd"/>
-      <w:r>
-        <w:rPr>
-          <w:rFonts w:ascii="Times New Roman" w:eastAsia="Times New Roman" w:hAnsi="Times New Roman" w:cs="Times New Roman"/>
-          <w:kern w:val="0"/>
-          <w14:ligatures w14:val="none"/>
-        </w:rPr>
-        <w:t xml:space="preserve"> </w:t>
-      </w:r>
-      <w:proofErr w:type="spellStart"/>
-      <w:r>
-        <w:rPr>
-          <w:rFonts w:ascii="Times New Roman" w:eastAsia="Times New Roman" w:hAnsi="Times New Roman" w:cs="Times New Roman"/>
-          <w:kern w:val="0"/>
-          <w14:ligatures w14:val="none"/>
-        </w:rPr>
-        <w:t>setiap</w:t>
-      </w:r>
-      <w:proofErr w:type="spellEnd"/>
-      <w:r>
-        <w:rPr>
-          <w:rFonts w:ascii="Times New Roman" w:eastAsia="Times New Roman" w:hAnsi="Times New Roman" w:cs="Times New Roman"/>
-          <w:kern w:val="0"/>
-          <w14:ligatures w14:val="none"/>
-        </w:rPr>
-        <w:t xml:space="preserve"> </w:t>
-      </w:r>
-      <w:proofErr w:type="spellStart"/>
-      <w:r>
-        <w:rPr>
-          <w:rFonts w:ascii="Times New Roman" w:eastAsia="Times New Roman" w:hAnsi="Times New Roman" w:cs="Times New Roman"/>
-          <w:kern w:val="0"/>
-          <w14:ligatures w14:val="none"/>
-        </w:rPr>
-        <w:t>tahunnya</w:t>
-      </w:r>
-      <w:proofErr w:type="spellEnd"/>
-      <w:r>
-        <w:rPr>
-          <w:rFonts w:ascii="Times New Roman" w:eastAsia="Times New Roman" w:hAnsi="Times New Roman" w:cs="Times New Roman"/>
-          <w:kern w:val="0"/>
-          <w14:ligatures w14:val="none"/>
-        </w:rPr>
-        <w:t>:</w:t>
+        <w:t>110,2 juta</w:t>
+      </w:r>
+      <w:r>
+        <w:rPr>
+          <w:rFonts w:ascii="Times New Roman" w:eastAsia="Times New Roman" w:hAnsi="Times New Roman" w:cs="Times New Roman"/>
+          <w:kern w:val="0"/>
+          <w14:ligatures w14:val="none"/>
+        </w:rPr>
+        <w:t>. Angka ini terus bertambah setiap tahunnya:</w:t>
       </w:r>
     </w:p>
     <w:p>
@@ -1118,18 +486,8 @@
           <w:kern w:val="0"/>
           <w14:ligatures w14:val="none"/>
         </w:rPr>
-        <w:t xml:space="preserve">: 132,7 </w:t>
-      </w:r>
-      <w:proofErr w:type="spellStart"/>
-      <w:r>
-        <w:rPr>
-          <w:rFonts w:ascii="Times New Roman" w:eastAsia="Times New Roman" w:hAnsi="Times New Roman" w:cs="Times New Roman"/>
-          <w:kern w:val="0"/>
-          <w14:ligatures w14:val="none"/>
-        </w:rPr>
-        <w:t>juta</w:t>
-      </w:r>
-      <w:proofErr w:type="spellEnd"/>
+        <w:t>: 132,7 juta</w:t>
+      </w:r>
     </w:p>
     <w:p>
       <w:pPr>
@@ -1160,18 +518,8 @@
           <w:kern w:val="0"/>
           <w14:ligatures w14:val="none"/>
         </w:rPr>
-        <w:t xml:space="preserve">: 143,26 </w:t>
-      </w:r>
-      <w:proofErr w:type="spellStart"/>
-      <w:r>
-        <w:rPr>
-          <w:rFonts w:ascii="Times New Roman" w:eastAsia="Times New Roman" w:hAnsi="Times New Roman" w:cs="Times New Roman"/>
-          <w:kern w:val="0"/>
-          <w14:ligatures w14:val="none"/>
-        </w:rPr>
-        <w:t>juta</w:t>
-      </w:r>
-      <w:proofErr w:type="spellEnd"/>
+        <w:t>: 143,26 juta</w:t>
+      </w:r>
     </w:p>
     <w:p>
       <w:pPr>
@@ -1203,18 +551,8 @@
           <w:kern w:val="0"/>
           <w14:ligatures w14:val="none"/>
         </w:rPr>
-        <w:t xml:space="preserve">: 171,17 </w:t>
-      </w:r>
-      <w:proofErr w:type="spellStart"/>
-      <w:r>
-        <w:rPr>
-          <w:rFonts w:ascii="Times New Roman" w:eastAsia="Times New Roman" w:hAnsi="Times New Roman" w:cs="Times New Roman"/>
-          <w:kern w:val="0"/>
-          <w14:ligatures w14:val="none"/>
-        </w:rPr>
-        <w:t>juta</w:t>
-      </w:r>
-      <w:proofErr w:type="spellEnd"/>
+        <w:t>: 171,17 juta</w:t>
+      </w:r>
     </w:p>
     <w:p>
       <w:pPr>
@@ -1245,18 +583,8 @@
           <w:kern w:val="0"/>
           <w14:ligatures w14:val="none"/>
         </w:rPr>
-        <w:t xml:space="preserve">: 196,71 </w:t>
-      </w:r>
-      <w:proofErr w:type="spellStart"/>
-      <w:r>
-        <w:rPr>
-          <w:rFonts w:ascii="Times New Roman" w:eastAsia="Times New Roman" w:hAnsi="Times New Roman" w:cs="Times New Roman"/>
-          <w:kern w:val="0"/>
-          <w14:ligatures w14:val="none"/>
-        </w:rPr>
-        <w:t>juta</w:t>
-      </w:r>
-      <w:proofErr w:type="spellEnd"/>
+        <w:t>: 196,71 juta</w:t>
+      </w:r>
     </w:p>
     <w:p>
       <w:pPr>
@@ -1287,18 +615,8 @@
           <w:kern w:val="0"/>
           <w14:ligatures w14:val="none"/>
         </w:rPr>
-        <w:t xml:space="preserve">: 210,03 </w:t>
-      </w:r>
-      <w:proofErr w:type="spellStart"/>
-      <w:r>
-        <w:rPr>
-          <w:rFonts w:ascii="Times New Roman" w:eastAsia="Times New Roman" w:hAnsi="Times New Roman" w:cs="Times New Roman"/>
-          <w:kern w:val="0"/>
-          <w14:ligatures w14:val="none"/>
-        </w:rPr>
-        <w:t>juta</w:t>
-      </w:r>
-      <w:proofErr w:type="spellEnd"/>
+        <w:t>: 210,03 juta</w:t>
+      </w:r>
     </w:p>
     <w:p>
       <w:pPr>
@@ -1329,18 +647,8 @@
           <w:kern w:val="0"/>
           <w14:ligatures w14:val="none"/>
         </w:rPr>
-        <w:t xml:space="preserve">: 215,63 </w:t>
-      </w:r>
-      <w:proofErr w:type="spellStart"/>
-      <w:r>
-        <w:rPr>
-          <w:rFonts w:ascii="Times New Roman" w:eastAsia="Times New Roman" w:hAnsi="Times New Roman" w:cs="Times New Roman"/>
-          <w:kern w:val="0"/>
-          <w14:ligatures w14:val="none"/>
-        </w:rPr>
-        <w:t>juta</w:t>
-      </w:r>
-      <w:proofErr w:type="spellEnd"/>
+        <w:t>: 215,63 juta</w:t>
+      </w:r>
     </w:p>
     <w:p>
       <w:pPr>
@@ -1351,545 +659,13 @@
           <w14:ligatures w14:val="none"/>
         </w:rPr>
       </w:pPr>
-      <w:proofErr w:type="spellStart"/>
-      <w:r>
-        <w:rPr>
-          <w:rFonts w:ascii="Times New Roman" w:eastAsia="Times New Roman" w:hAnsi="Times New Roman" w:cs="Times New Roman"/>
-          <w:kern w:val="0"/>
-          <w14:ligatures w14:val="none"/>
-        </w:rPr>
-        <w:t>Peningkatan</w:t>
-      </w:r>
-      <w:proofErr w:type="spellEnd"/>
-      <w:r>
-        <w:rPr>
-          <w:rFonts w:ascii="Times New Roman" w:eastAsia="Times New Roman" w:hAnsi="Times New Roman" w:cs="Times New Roman"/>
-          <w:kern w:val="0"/>
-          <w14:ligatures w14:val="none"/>
-        </w:rPr>
-        <w:t xml:space="preserve"> </w:t>
-      </w:r>
-      <w:proofErr w:type="spellStart"/>
-      <w:r>
-        <w:rPr>
-          <w:rFonts w:ascii="Times New Roman" w:eastAsia="Times New Roman" w:hAnsi="Times New Roman" w:cs="Times New Roman"/>
-          <w:kern w:val="0"/>
-          <w14:ligatures w14:val="none"/>
-        </w:rPr>
-        <w:t>signifikan</w:t>
-      </w:r>
-      <w:proofErr w:type="spellEnd"/>
-      <w:r>
-        <w:rPr>
-          <w:rFonts w:ascii="Times New Roman" w:eastAsia="Times New Roman" w:hAnsi="Times New Roman" w:cs="Times New Roman"/>
-          <w:kern w:val="0"/>
-          <w14:ligatures w14:val="none"/>
-        </w:rPr>
-        <w:t xml:space="preserve"> </w:t>
-      </w:r>
-      <w:proofErr w:type="spellStart"/>
-      <w:r>
-        <w:rPr>
-          <w:rFonts w:ascii="Times New Roman" w:eastAsia="Times New Roman" w:hAnsi="Times New Roman" w:cs="Times New Roman"/>
-          <w:kern w:val="0"/>
-          <w14:ligatures w14:val="none"/>
-        </w:rPr>
-        <w:t>ini</w:t>
-      </w:r>
-      <w:proofErr w:type="spellEnd"/>
-      <w:r>
-        <w:rPr>
-          <w:rFonts w:ascii="Times New Roman" w:eastAsia="Times New Roman" w:hAnsi="Times New Roman" w:cs="Times New Roman"/>
-          <w:kern w:val="0"/>
-          <w14:ligatures w14:val="none"/>
-        </w:rPr>
-        <w:t xml:space="preserve"> </w:t>
-      </w:r>
-      <w:proofErr w:type="spellStart"/>
-      <w:r>
-        <w:rPr>
-          <w:rFonts w:ascii="Times New Roman" w:eastAsia="Times New Roman" w:hAnsi="Times New Roman" w:cs="Times New Roman"/>
-          <w:kern w:val="0"/>
-          <w14:ligatures w14:val="none"/>
-        </w:rPr>
-        <w:t>menunjukkan</w:t>
-      </w:r>
-      <w:proofErr w:type="spellEnd"/>
-      <w:r>
-        <w:rPr>
-          <w:rFonts w:ascii="Times New Roman" w:eastAsia="Times New Roman" w:hAnsi="Times New Roman" w:cs="Times New Roman"/>
-          <w:kern w:val="0"/>
-          <w14:ligatures w14:val="none"/>
-        </w:rPr>
-        <w:t xml:space="preserve"> </w:t>
-      </w:r>
-      <w:proofErr w:type="spellStart"/>
-      <w:r>
-        <w:rPr>
-          <w:rFonts w:ascii="Times New Roman" w:eastAsia="Times New Roman" w:hAnsi="Times New Roman" w:cs="Times New Roman"/>
-          <w:kern w:val="0"/>
-          <w14:ligatures w14:val="none"/>
-        </w:rPr>
-        <w:t>bahwa</w:t>
-      </w:r>
-      <w:proofErr w:type="spellEnd"/>
-      <w:r>
-        <w:rPr>
-          <w:rFonts w:ascii="Times New Roman" w:eastAsia="Times New Roman" w:hAnsi="Times New Roman" w:cs="Times New Roman"/>
-          <w:kern w:val="0"/>
-          <w14:ligatures w14:val="none"/>
-        </w:rPr>
-        <w:t xml:space="preserve"> </w:t>
-      </w:r>
-      <w:proofErr w:type="spellStart"/>
-      <w:r>
-        <w:rPr>
-          <w:rFonts w:ascii="Times New Roman" w:eastAsia="Times New Roman" w:hAnsi="Times New Roman" w:cs="Times New Roman"/>
-          <w:kern w:val="0"/>
-          <w14:ligatures w14:val="none"/>
-        </w:rPr>
-        <w:t>akses</w:t>
-      </w:r>
-      <w:proofErr w:type="spellEnd"/>
-      <w:r>
-        <w:rPr>
-          <w:rFonts w:ascii="Times New Roman" w:eastAsia="Times New Roman" w:hAnsi="Times New Roman" w:cs="Times New Roman"/>
-          <w:kern w:val="0"/>
-          <w14:ligatures w14:val="none"/>
-        </w:rPr>
-        <w:t xml:space="preserve"> internet di Indonesia </w:t>
-      </w:r>
-      <w:proofErr w:type="spellStart"/>
-      <w:r>
-        <w:rPr>
-          <w:rFonts w:ascii="Times New Roman" w:eastAsia="Times New Roman" w:hAnsi="Times New Roman" w:cs="Times New Roman"/>
-          <w:kern w:val="0"/>
-          <w14:ligatures w14:val="none"/>
-        </w:rPr>
-        <w:t>semakin</w:t>
-      </w:r>
-      <w:proofErr w:type="spellEnd"/>
-      <w:r>
-        <w:rPr>
-          <w:rFonts w:ascii="Times New Roman" w:eastAsia="Times New Roman" w:hAnsi="Times New Roman" w:cs="Times New Roman"/>
-          <w:kern w:val="0"/>
-          <w14:ligatures w14:val="none"/>
-        </w:rPr>
-        <w:t xml:space="preserve"> </w:t>
-      </w:r>
-      <w:proofErr w:type="spellStart"/>
-      <w:r>
-        <w:rPr>
-          <w:rFonts w:ascii="Times New Roman" w:eastAsia="Times New Roman" w:hAnsi="Times New Roman" w:cs="Times New Roman"/>
-          <w:kern w:val="0"/>
-          <w14:ligatures w14:val="none"/>
-        </w:rPr>
-        <w:t>luas</w:t>
-      </w:r>
-      <w:proofErr w:type="spellEnd"/>
-      <w:r>
-        <w:rPr>
-          <w:rFonts w:ascii="Times New Roman" w:eastAsia="Times New Roman" w:hAnsi="Times New Roman" w:cs="Times New Roman"/>
-          <w:kern w:val="0"/>
-          <w14:ligatures w14:val="none"/>
-        </w:rPr>
-        <w:t xml:space="preserve"> dan </w:t>
-      </w:r>
-      <w:proofErr w:type="spellStart"/>
-      <w:r>
-        <w:rPr>
-          <w:rFonts w:ascii="Times New Roman" w:eastAsia="Times New Roman" w:hAnsi="Times New Roman" w:cs="Times New Roman"/>
-          <w:kern w:val="0"/>
-          <w14:ligatures w14:val="none"/>
-        </w:rPr>
-        <w:t>menjadi</w:t>
-      </w:r>
-      <w:proofErr w:type="spellEnd"/>
-      <w:r>
-        <w:rPr>
-          <w:rFonts w:ascii="Times New Roman" w:eastAsia="Times New Roman" w:hAnsi="Times New Roman" w:cs="Times New Roman"/>
-          <w:kern w:val="0"/>
-          <w14:ligatures w14:val="none"/>
-        </w:rPr>
-        <w:t xml:space="preserve"> </w:t>
-      </w:r>
-      <w:proofErr w:type="spellStart"/>
-      <w:r>
-        <w:rPr>
-          <w:rFonts w:ascii="Times New Roman" w:eastAsia="Times New Roman" w:hAnsi="Times New Roman" w:cs="Times New Roman"/>
-          <w:kern w:val="0"/>
-          <w14:ligatures w14:val="none"/>
-        </w:rPr>
-        <w:t>bagian</w:t>
-      </w:r>
-      <w:proofErr w:type="spellEnd"/>
-      <w:r>
-        <w:rPr>
-          <w:rFonts w:ascii="Times New Roman" w:eastAsia="Times New Roman" w:hAnsi="Times New Roman" w:cs="Times New Roman"/>
-          <w:kern w:val="0"/>
-          <w14:ligatures w14:val="none"/>
-        </w:rPr>
-        <w:t xml:space="preserve"> </w:t>
-      </w:r>
-      <w:proofErr w:type="spellStart"/>
-      <w:r>
-        <w:rPr>
-          <w:rFonts w:ascii="Times New Roman" w:eastAsia="Times New Roman" w:hAnsi="Times New Roman" w:cs="Times New Roman"/>
-          <w:kern w:val="0"/>
-          <w14:ligatures w14:val="none"/>
-        </w:rPr>
-        <w:t>tak</w:t>
-      </w:r>
-      <w:proofErr w:type="spellEnd"/>
-      <w:r>
-        <w:rPr>
-          <w:rFonts w:ascii="Times New Roman" w:eastAsia="Times New Roman" w:hAnsi="Times New Roman" w:cs="Times New Roman"/>
-          <w:kern w:val="0"/>
-          <w14:ligatures w14:val="none"/>
-        </w:rPr>
-        <w:t xml:space="preserve"> </w:t>
-      </w:r>
-      <w:proofErr w:type="spellStart"/>
-      <w:r>
-        <w:rPr>
-          <w:rFonts w:ascii="Times New Roman" w:eastAsia="Times New Roman" w:hAnsi="Times New Roman" w:cs="Times New Roman"/>
-          <w:kern w:val="0"/>
-          <w14:ligatures w14:val="none"/>
-        </w:rPr>
-        <w:t>terpisahkan</w:t>
-      </w:r>
-      <w:proofErr w:type="spellEnd"/>
-      <w:r>
-        <w:rPr>
-          <w:rFonts w:ascii="Times New Roman" w:eastAsia="Times New Roman" w:hAnsi="Times New Roman" w:cs="Times New Roman"/>
-          <w:kern w:val="0"/>
-          <w14:ligatures w14:val="none"/>
-        </w:rPr>
-        <w:t xml:space="preserve"> </w:t>
-      </w:r>
-      <w:proofErr w:type="spellStart"/>
-      <w:r>
-        <w:rPr>
-          <w:rFonts w:ascii="Times New Roman" w:eastAsia="Times New Roman" w:hAnsi="Times New Roman" w:cs="Times New Roman"/>
-          <w:kern w:val="0"/>
-          <w14:ligatures w14:val="none"/>
-        </w:rPr>
-        <w:t>dari</w:t>
-      </w:r>
-      <w:proofErr w:type="spellEnd"/>
-      <w:r>
-        <w:rPr>
-          <w:rFonts w:ascii="Times New Roman" w:eastAsia="Times New Roman" w:hAnsi="Times New Roman" w:cs="Times New Roman"/>
-          <w:kern w:val="0"/>
-          <w14:ligatures w14:val="none"/>
-        </w:rPr>
-        <w:t xml:space="preserve"> </w:t>
-      </w:r>
-      <w:proofErr w:type="spellStart"/>
-      <w:r>
-        <w:rPr>
-          <w:rFonts w:ascii="Times New Roman" w:eastAsia="Times New Roman" w:hAnsi="Times New Roman" w:cs="Times New Roman"/>
-          <w:kern w:val="0"/>
-          <w14:ligatures w14:val="none"/>
-        </w:rPr>
-        <w:t>kehidupan</w:t>
-      </w:r>
-      <w:proofErr w:type="spellEnd"/>
-      <w:r>
-        <w:rPr>
-          <w:rFonts w:ascii="Times New Roman" w:eastAsia="Times New Roman" w:hAnsi="Times New Roman" w:cs="Times New Roman"/>
-          <w:kern w:val="0"/>
-          <w14:ligatures w14:val="none"/>
-        </w:rPr>
-        <w:t xml:space="preserve"> </w:t>
-      </w:r>
-      <w:proofErr w:type="spellStart"/>
-      <w:r>
-        <w:rPr>
-          <w:rFonts w:ascii="Times New Roman" w:eastAsia="Times New Roman" w:hAnsi="Times New Roman" w:cs="Times New Roman"/>
-          <w:kern w:val="0"/>
-          <w14:ligatures w14:val="none"/>
-        </w:rPr>
-        <w:t>masyarakat</w:t>
-      </w:r>
-      <w:proofErr w:type="spellEnd"/>
-      <w:r>
-        <w:rPr>
-          <w:rFonts w:ascii="Times New Roman" w:eastAsia="Times New Roman" w:hAnsi="Times New Roman" w:cs="Times New Roman"/>
-          <w:kern w:val="0"/>
-          <w14:ligatures w14:val="none"/>
-        </w:rPr>
-        <w:t xml:space="preserve">. </w:t>
-      </w:r>
-      <w:proofErr w:type="spellStart"/>
-      <w:r>
-        <w:rPr>
-          <w:rFonts w:ascii="Times New Roman" w:eastAsia="Times New Roman" w:hAnsi="Times New Roman" w:cs="Times New Roman"/>
-          <w:kern w:val="0"/>
-          <w14:ligatures w14:val="none"/>
-        </w:rPr>
-        <w:t>Dengan</w:t>
-      </w:r>
-      <w:proofErr w:type="spellEnd"/>
-      <w:r>
-        <w:rPr>
-          <w:rFonts w:ascii="Times New Roman" w:eastAsia="Times New Roman" w:hAnsi="Times New Roman" w:cs="Times New Roman"/>
-          <w:kern w:val="0"/>
-          <w14:ligatures w14:val="none"/>
-        </w:rPr>
-        <w:t xml:space="preserve"> </w:t>
-      </w:r>
-      <w:proofErr w:type="spellStart"/>
-      <w:r>
-        <w:rPr>
-          <w:rFonts w:ascii="Times New Roman" w:eastAsia="Times New Roman" w:hAnsi="Times New Roman" w:cs="Times New Roman"/>
-          <w:kern w:val="0"/>
-          <w14:ligatures w14:val="none"/>
-        </w:rPr>
-        <w:t>semakin</w:t>
-      </w:r>
-      <w:proofErr w:type="spellEnd"/>
-      <w:r>
-        <w:rPr>
-          <w:rFonts w:ascii="Times New Roman" w:eastAsia="Times New Roman" w:hAnsi="Times New Roman" w:cs="Times New Roman"/>
-          <w:kern w:val="0"/>
-          <w14:ligatures w14:val="none"/>
-        </w:rPr>
-        <w:t xml:space="preserve"> </w:t>
-      </w:r>
-      <w:proofErr w:type="spellStart"/>
-      <w:r>
-        <w:rPr>
-          <w:rFonts w:ascii="Times New Roman" w:eastAsia="Times New Roman" w:hAnsi="Times New Roman" w:cs="Times New Roman"/>
-          <w:kern w:val="0"/>
-          <w14:ligatures w14:val="none"/>
-        </w:rPr>
-        <w:t>banyaknya</w:t>
-      </w:r>
-      <w:proofErr w:type="spellEnd"/>
-      <w:r>
-        <w:rPr>
-          <w:rFonts w:ascii="Times New Roman" w:eastAsia="Times New Roman" w:hAnsi="Times New Roman" w:cs="Times New Roman"/>
-          <w:kern w:val="0"/>
-          <w14:ligatures w14:val="none"/>
-        </w:rPr>
-        <w:t xml:space="preserve"> </w:t>
-      </w:r>
-      <w:proofErr w:type="spellStart"/>
-      <w:r>
-        <w:rPr>
-          <w:rFonts w:ascii="Times New Roman" w:eastAsia="Times New Roman" w:hAnsi="Times New Roman" w:cs="Times New Roman"/>
-          <w:kern w:val="0"/>
-          <w14:ligatures w14:val="none"/>
-        </w:rPr>
-        <w:t>pengguna</w:t>
-      </w:r>
-      <w:proofErr w:type="spellEnd"/>
-      <w:r>
-        <w:rPr>
-          <w:rFonts w:ascii="Times New Roman" w:eastAsia="Times New Roman" w:hAnsi="Times New Roman" w:cs="Times New Roman"/>
-          <w:kern w:val="0"/>
-          <w14:ligatures w14:val="none"/>
-        </w:rPr>
-        <w:t xml:space="preserve"> internet, </w:t>
-      </w:r>
-      <w:proofErr w:type="spellStart"/>
-      <w:r>
-        <w:rPr>
-          <w:rFonts w:ascii="Times New Roman" w:eastAsia="Times New Roman" w:hAnsi="Times New Roman" w:cs="Times New Roman"/>
-          <w:kern w:val="0"/>
-          <w14:ligatures w14:val="none"/>
-        </w:rPr>
-        <w:t>peluang</w:t>
-      </w:r>
-      <w:proofErr w:type="spellEnd"/>
-      <w:r>
-        <w:rPr>
-          <w:rFonts w:ascii="Times New Roman" w:eastAsia="Times New Roman" w:hAnsi="Times New Roman" w:cs="Times New Roman"/>
-          <w:kern w:val="0"/>
-          <w14:ligatures w14:val="none"/>
-        </w:rPr>
-        <w:t xml:space="preserve"> di </w:t>
-      </w:r>
-      <w:proofErr w:type="spellStart"/>
-      <w:r>
-        <w:rPr>
-          <w:rFonts w:ascii="Times New Roman" w:eastAsia="Times New Roman" w:hAnsi="Times New Roman" w:cs="Times New Roman"/>
-          <w:kern w:val="0"/>
-          <w14:ligatures w14:val="none"/>
-        </w:rPr>
-        <w:t>bidang</w:t>
-      </w:r>
-      <w:proofErr w:type="spellEnd"/>
-      <w:r>
-        <w:rPr>
-          <w:rFonts w:ascii="Times New Roman" w:eastAsia="Times New Roman" w:hAnsi="Times New Roman" w:cs="Times New Roman"/>
-          <w:kern w:val="0"/>
-          <w14:ligatures w14:val="none"/>
-        </w:rPr>
-        <w:t xml:space="preserve"> digital juga </w:t>
-      </w:r>
-      <w:proofErr w:type="spellStart"/>
-      <w:r>
-        <w:rPr>
-          <w:rFonts w:ascii="Times New Roman" w:eastAsia="Times New Roman" w:hAnsi="Times New Roman" w:cs="Times New Roman"/>
-          <w:kern w:val="0"/>
-          <w14:ligatures w14:val="none"/>
-        </w:rPr>
-        <w:t>semakin</w:t>
-      </w:r>
-      <w:proofErr w:type="spellEnd"/>
-      <w:r>
-        <w:rPr>
-          <w:rFonts w:ascii="Times New Roman" w:eastAsia="Times New Roman" w:hAnsi="Times New Roman" w:cs="Times New Roman"/>
-          <w:kern w:val="0"/>
-          <w14:ligatures w14:val="none"/>
-        </w:rPr>
-        <w:t xml:space="preserve"> </w:t>
-      </w:r>
-      <w:proofErr w:type="spellStart"/>
-      <w:r>
-        <w:rPr>
-          <w:rFonts w:ascii="Times New Roman" w:eastAsia="Times New Roman" w:hAnsi="Times New Roman" w:cs="Times New Roman"/>
-          <w:kern w:val="0"/>
-          <w14:ligatures w14:val="none"/>
-        </w:rPr>
-        <w:t>besar</w:t>
-      </w:r>
-      <w:proofErr w:type="spellEnd"/>
-      <w:r>
-        <w:rPr>
-          <w:rFonts w:ascii="Times New Roman" w:eastAsia="Times New Roman" w:hAnsi="Times New Roman" w:cs="Times New Roman"/>
-          <w:kern w:val="0"/>
-          <w14:ligatures w14:val="none"/>
-        </w:rPr>
-        <w:t xml:space="preserve">, </w:t>
-      </w:r>
-      <w:proofErr w:type="spellStart"/>
-      <w:r>
-        <w:rPr>
-          <w:rFonts w:ascii="Times New Roman" w:eastAsia="Times New Roman" w:hAnsi="Times New Roman" w:cs="Times New Roman"/>
-          <w:kern w:val="0"/>
-          <w14:ligatures w14:val="none"/>
-        </w:rPr>
-        <w:t>baik</w:t>
-      </w:r>
-      <w:proofErr w:type="spellEnd"/>
-      <w:r>
-        <w:rPr>
-          <w:rFonts w:ascii="Times New Roman" w:eastAsia="Times New Roman" w:hAnsi="Times New Roman" w:cs="Times New Roman"/>
-          <w:kern w:val="0"/>
-          <w14:ligatures w14:val="none"/>
-        </w:rPr>
-        <w:t xml:space="preserve"> </w:t>
-      </w:r>
-      <w:proofErr w:type="spellStart"/>
-      <w:r>
-        <w:rPr>
-          <w:rFonts w:ascii="Times New Roman" w:eastAsia="Times New Roman" w:hAnsi="Times New Roman" w:cs="Times New Roman"/>
-          <w:kern w:val="0"/>
-          <w14:ligatures w14:val="none"/>
-        </w:rPr>
-        <w:t>dalam</w:t>
-      </w:r>
-      <w:proofErr w:type="spellEnd"/>
-      <w:r>
-        <w:rPr>
-          <w:rFonts w:ascii="Times New Roman" w:eastAsia="Times New Roman" w:hAnsi="Times New Roman" w:cs="Times New Roman"/>
-          <w:kern w:val="0"/>
-          <w14:ligatures w14:val="none"/>
-        </w:rPr>
-        <w:t xml:space="preserve"> </w:t>
-      </w:r>
-      <w:proofErr w:type="spellStart"/>
-      <w:r>
-        <w:rPr>
-          <w:rFonts w:ascii="Times New Roman" w:eastAsia="Times New Roman" w:hAnsi="Times New Roman" w:cs="Times New Roman"/>
-          <w:kern w:val="0"/>
-          <w14:ligatures w14:val="none"/>
-        </w:rPr>
-        <w:t>sektor</w:t>
-      </w:r>
-      <w:proofErr w:type="spellEnd"/>
-      <w:r>
-        <w:rPr>
-          <w:rFonts w:ascii="Times New Roman" w:eastAsia="Times New Roman" w:hAnsi="Times New Roman" w:cs="Times New Roman"/>
-          <w:kern w:val="0"/>
-          <w14:ligatures w14:val="none"/>
-        </w:rPr>
-        <w:t xml:space="preserve"> </w:t>
-      </w:r>
-      <w:proofErr w:type="spellStart"/>
-      <w:r>
-        <w:rPr>
-          <w:rFonts w:ascii="Times New Roman" w:eastAsia="Times New Roman" w:hAnsi="Times New Roman" w:cs="Times New Roman"/>
-          <w:kern w:val="0"/>
-          <w14:ligatures w14:val="none"/>
-        </w:rPr>
-        <w:t>bisnis</w:t>
-      </w:r>
-      <w:proofErr w:type="spellEnd"/>
-      <w:r>
-        <w:rPr>
-          <w:rFonts w:ascii="Times New Roman" w:eastAsia="Times New Roman" w:hAnsi="Times New Roman" w:cs="Times New Roman"/>
-          <w:kern w:val="0"/>
-          <w14:ligatures w14:val="none"/>
-        </w:rPr>
-        <w:t xml:space="preserve">, </w:t>
-      </w:r>
-      <w:proofErr w:type="spellStart"/>
-      <w:r>
-        <w:rPr>
-          <w:rFonts w:ascii="Times New Roman" w:eastAsia="Times New Roman" w:hAnsi="Times New Roman" w:cs="Times New Roman"/>
-          <w:kern w:val="0"/>
-          <w14:ligatures w14:val="none"/>
-        </w:rPr>
-        <w:t>pendidikan</w:t>
-      </w:r>
-      <w:proofErr w:type="spellEnd"/>
-      <w:r>
-        <w:rPr>
-          <w:rFonts w:ascii="Times New Roman" w:eastAsia="Times New Roman" w:hAnsi="Times New Roman" w:cs="Times New Roman"/>
-          <w:kern w:val="0"/>
-          <w14:ligatures w14:val="none"/>
-        </w:rPr>
-        <w:t xml:space="preserve">, </w:t>
-      </w:r>
-      <w:proofErr w:type="spellStart"/>
-      <w:r>
-        <w:rPr>
-          <w:rFonts w:ascii="Times New Roman" w:eastAsia="Times New Roman" w:hAnsi="Times New Roman" w:cs="Times New Roman"/>
-          <w:kern w:val="0"/>
-          <w14:ligatures w14:val="none"/>
-        </w:rPr>
-        <w:t>maupun</w:t>
-      </w:r>
-      <w:proofErr w:type="spellEnd"/>
-      <w:r>
-        <w:rPr>
-          <w:rFonts w:ascii="Times New Roman" w:eastAsia="Times New Roman" w:hAnsi="Times New Roman" w:cs="Times New Roman"/>
-          <w:kern w:val="0"/>
-          <w14:ligatures w14:val="none"/>
-        </w:rPr>
-        <w:t xml:space="preserve"> </w:t>
-      </w:r>
-      <w:proofErr w:type="spellStart"/>
-      <w:r>
-        <w:rPr>
-          <w:rFonts w:ascii="Times New Roman" w:eastAsia="Times New Roman" w:hAnsi="Times New Roman" w:cs="Times New Roman"/>
-          <w:kern w:val="0"/>
-          <w14:ligatures w14:val="none"/>
-        </w:rPr>
-        <w:t>hiburan</w:t>
-      </w:r>
-      <w:proofErr w:type="spellEnd"/>
-      <w:r>
-        <w:rPr>
-          <w:rFonts w:ascii="Times New Roman" w:eastAsia="Times New Roman" w:hAnsi="Times New Roman" w:cs="Times New Roman"/>
-          <w:kern w:val="0"/>
-          <w14:ligatures w14:val="none"/>
-        </w:rPr>
-        <w:t>.</w:t>
+      <w:r>
+        <w:rPr>
+          <w:rFonts w:ascii="Times New Roman" w:eastAsia="Times New Roman" w:hAnsi="Times New Roman" w:cs="Times New Roman"/>
+          <w:kern w:val="0"/>
+          <w14:ligatures w14:val="none"/>
+        </w:rPr>
+        <w:t>Peningkatan signifikan ini menunjukkan bahwa akses internet di Indonesia semakin luas dan menjadi bagian tak terpisahkan dari kehidupan masyarakat. Dengan semakin banyaknya pengguna internet, peluang di bidang digital juga semakin besar, baik dalam sektor bisnis, pendidikan, maupun hiburan.</w:t>
       </w:r>
     </w:p>
     <w:sectPr>
@@ -1903,7 +679,7 @@
 </file>
 
 <file path=word/numbering.xml><?xml version="1.0" encoding="utf-8"?>
-<w:numbering xmlns:wpc="http://schemas.microsoft.com/office/word/2010/wordprocessingCanvas" xmlns:cx="http://schemas.microsoft.com/office/drawing/2014/chartex" xmlns:cx1="http://schemas.microsoft.com/office/drawing/2015/9/8/chartex" xmlns:cx2="http://schemas.microsoft.com/office/drawing/2015/10/21/chartex" xmlns:cx3="http://schemas.microsoft.com/office/drawing/2016/5/9/chartex" xmlns:cx4="http://schemas.microsoft.com/office/drawing/2016/5/10/chartex" xmlns:cx5="http://schemas.microsoft.com/office/drawing/2016/5/11/chartex" xmlns:cx6="http://schemas.microsoft.com/office/drawing/2016/5/12/chartex" xmlns:cx7="http://schemas.microsoft.com/office/drawing/2016/5/13/chartex" xmlns:cx8="http://schemas.microsoft.com/office/drawing/2016/5/14/chartex" xmlns:mc="http://schemas.openxmlformats.org/markup-compatibility/2006" xmlns:aink="http://schemas.microsoft.com/office/drawing/2016/ink" xmlns:am3d="http://schemas.microsoft.com/office/drawing/2017/model3d" xmlns:o="urn:schemas-microsoft-com:office:office" xmlns:oel="http://schemas.microsoft.com/office/2019/extlst" xmlns:r="http://schemas.openxmlformats.org/officeDocument/2006/relationships" xmlns:m="http://schemas.openxmlformats.org/officeDocument/2006/math" xmlns:v="urn:schemas-microsoft-com:vml" xmlns:wp14="http://schemas.microsoft.com/office/word/2010/wordprocessingDrawing" xmlns:wp="http://schemas.openxmlformats.org/drawingml/2006/wordprocessingDrawing" xmlns:w10="urn:schemas-microsoft-com:office:word" xmlns:w="http://schemas.openxmlformats.org/wordprocessingml/2006/main" xmlns:w14="http://schemas.microsoft.com/office/word/2010/wordml" xmlns:w15="http://schemas.microsoft.com/office/word/2012/wordml" xmlns:w16cex="http://schemas.microsoft.com/office/word/2018/wordml/cex" xmlns:w16cid="http://schemas.microsoft.com/office/word/2016/wordml/cid" xmlns:w16="http://schemas.microsoft.com/office/word/2018/wordml" xmlns:w16du="http://schemas.microsoft.com/office/word/2023/wordml/word16du" xmlns:w16sdtdh="http://schemas.microsoft.com/office/word/2020/wordml/sdtdatahash" xmlns:w16sdtfl="http://schemas.microsoft.com/office/word/2024/wordml/sdtformatlock" xmlns:w16se="http://schemas.microsoft.com/office/word/2015/wordml/symex" xmlns:wpg="http://schemas.microsoft.com/office/word/2010/wordprocessingGroup" xmlns:wpi="http://schemas.microsoft.com/office/word/2010/wordprocessingInk" xmlns:wne="http://schemas.microsoft.com/office/word/2006/wordml" xmlns:wps="http://schemas.microsoft.com/office/word/2010/wordprocessingShape" mc:Ignorable="w14 w15 w16se w16cid w16 w16cex w16sdtdh w16sdtfl w16du wp14">
+<w:numbering xmlns:wpc="http://schemas.microsoft.com/office/word/2010/wordprocessingCanvas" xmlns:cx="http://schemas.microsoft.com/office/drawing/2014/chartex" xmlns:cx1="http://schemas.microsoft.com/office/drawing/2015/9/8/chartex" xmlns:cx2="http://schemas.microsoft.com/office/drawing/2015/10/21/chartex" xmlns:cx3="http://schemas.microsoft.com/office/drawing/2016/5/9/chartex" xmlns:cx4="http://schemas.microsoft.com/office/drawing/2016/5/10/chartex" xmlns:cx5="http://schemas.microsoft.com/office/drawing/2016/5/11/chartex" xmlns:cx6="http://schemas.microsoft.com/office/drawing/2016/5/12/chartex" xmlns:cx7="http://schemas.microsoft.com/office/drawing/2016/5/13/chartex" xmlns:cx8="http://schemas.microsoft.com/office/drawing/2016/5/14/chartex" xmlns:mc="http://schemas.openxmlformats.org/markup-compatibility/2006" xmlns:aink="http://schemas.microsoft.com/office/drawing/2016/ink" xmlns:am3d="http://schemas.microsoft.com/office/drawing/2017/model3d" xmlns:o="urn:schemas-microsoft-com:office:office" xmlns:oel="http://schemas.microsoft.com/office/2019/extlst" xmlns:r="http://schemas.openxmlformats.org/officeDocument/2006/relationships" xmlns:m="http://schemas.openxmlformats.org/officeDocument/2006/math" xmlns:v="urn:schemas-microsoft-com:vml" xmlns:wp14="http://schemas.microsoft.com/office/word/2010/wordprocessingDrawing" xmlns:wp="http://schemas.openxmlformats.org/drawingml/2006/wordprocessingDrawing" xmlns:w10="urn:schemas-microsoft-com:office:word" xmlns:w="http://schemas.openxmlformats.org/wordprocessingml/2006/main" xmlns:w14="http://schemas.microsoft.com/office/word/2010/wordml" xmlns:w15="http://schemas.microsoft.com/office/word/2012/wordml" xmlns:w16cex="http://schemas.microsoft.com/office/word/2018/wordml/cex" xmlns:w16cid="http://schemas.microsoft.com/office/word/2016/wordml/cid" xmlns:w16="http://schemas.microsoft.com/office/word/2018/wordml" xmlns:w16du="http://schemas.microsoft.com/office/word/2023/wordml/word16du" xmlns:w16sdtdh="http://schemas.microsoft.com/office/word/2020/wordml/sdtdatahash" xmlns:w16se="http://schemas.microsoft.com/office/word/2015/wordml/symex" xmlns:wpg="http://schemas.microsoft.com/office/word/2010/wordprocessingGroup" xmlns:wpi="http://schemas.microsoft.com/office/word/2010/wordprocessingInk" xmlns:wne="http://schemas.microsoft.com/office/word/2006/wordml" xmlns:wps="http://schemas.microsoft.com/office/word/2010/wordprocessingShape" mc:Ignorable="w14 w15 w16se w16cid w16 w16cex w16sdtdh w16du wp14">
   <w:abstractNum w:abstractNumId="0" w15:restartNumberingAfterBreak="0">
     <w:nsid w:val="3FBC59E8"/>
     <w:multiLevelType w:val="multilevel"/>
@@ -2060,7 +836,7 @@
 </file>
 
 <file path=word/styles.xml><?xml version="1.0" encoding="utf-8"?>
-<w:styles xmlns:mc="http://schemas.openxmlformats.org/markup-compatibility/2006" xmlns:r="http://schemas.openxmlformats.org/officeDocument/2006/relationships" xmlns:w="http://schemas.openxmlformats.org/wordprocessingml/2006/main" xmlns:w14="http://schemas.microsoft.com/office/word/2010/wordml" xmlns:w15="http://schemas.microsoft.com/office/word/2012/wordml" xmlns:w16cex="http://schemas.microsoft.com/office/word/2018/wordml/cex" xmlns:w16cid="http://schemas.microsoft.com/office/word/2016/wordml/cid" xmlns:w16="http://schemas.microsoft.com/office/word/2018/wordml" xmlns:w16du="http://schemas.microsoft.com/office/word/2023/wordml/word16du" xmlns:w16sdtdh="http://schemas.microsoft.com/office/word/2020/wordml/sdtdatahash" xmlns:w16sdtfl="http://schemas.microsoft.com/office/word/2024/wordml/sdtformatlock" xmlns:w16se="http://schemas.microsoft.com/office/word/2015/wordml/symex" mc:Ignorable="w14 w15 w16se w16cid w16 w16cex w16sdtdh w16sdtfl w16du">
+<w:styles xmlns:mc="http://schemas.openxmlformats.org/markup-compatibility/2006" xmlns:r="http://schemas.openxmlformats.org/officeDocument/2006/relationships" xmlns:w="http://schemas.openxmlformats.org/wordprocessingml/2006/main" xmlns:w14="http://schemas.microsoft.com/office/word/2010/wordml" xmlns:w15="http://schemas.microsoft.com/office/word/2012/wordml" xmlns:w16cex="http://schemas.microsoft.com/office/word/2018/wordml/cex" xmlns:w16cid="http://schemas.microsoft.com/office/word/2016/wordml/cid" xmlns:w16="http://schemas.microsoft.com/office/word/2018/wordml" xmlns:w16du="http://schemas.microsoft.com/office/word/2023/wordml/word16du" xmlns:w16sdtdh="http://schemas.microsoft.com/office/word/2020/wordml/sdtdatahash" xmlns:w16se="http://schemas.microsoft.com/office/word/2015/wordml/symex" mc:Ignorable="w14 w15 w16se w16cid w16 w16cex w16sdtdh w16du">
   <w:docDefaults>
     <w:rPrDefault>
       <w:rPr>

</xml_diff>